<commit_message>
Syllabus: drop Nov 17 speaker, HW1 due Sept 16, add Oct 20 guest speaker (Hong Zhang, Netflix)
Co-Authored-By: Claude Fable 5.1 <noreply@anthropic.com>
</commit_message>
<xml_diff>
--- a/syllabus/mkt566-syllabus-proserpio.docx
+++ b/syllabus/mkt566-syllabus-proserpio.docx
@@ -5703,7 +5703,7 @@
                 <w:color w:val="000000" w:themeColor="text1"/>
                 <w:sz w:val="20"/>
               </w:rPr>
-              <w:t>Homework 1 due on Sept. 14</w:t>
+              <w:t>Homework 1 due on Sept. 16</w:t>
             </w:r>
           </w:p>
         </w:tc>
@@ -7132,7 +7132,7 @@
                 <w:sz w:val="20"/>
                 <w:szCs w:val="20"/>
               </w:rPr>
-              <w:t>Classifiers</w:t>
+              <w:t>Guest speaker: Hong Zhang (Marketing Data Science Manager, Netflix)</w:t>
             </w:r>
           </w:p>
           <w:p>
@@ -8346,50 +8346,6 @@
                 <w:szCs w:val="20"/>
               </w:rPr>
               <w:t>New topics: LLM and more</w:t>
-            </w:r>
-          </w:p>
-          <w:p>
-            <w:pPr>
-              <w:pStyle w:val="ListParagraph"/>
-              <w:numPr>
-                <w:ilvl w:val="0"/>
-                <w:numId w:val="33"/>
-              </w:numPr>
-              <w:ind w:left="261" w:hanging="180"/>
-              <w:rPr>
-                <w:rFonts w:asciiTheme="minorHAnsi" w:hAnsiTheme="minorHAnsi" w:cstheme="minorHAnsi"/>
-                <w:sz w:val="20"/>
-                <w:szCs w:val="20"/>
-              </w:rPr>
-            </w:pPr>
-            <w:r>
-              <w:rPr>
-                <w:rFonts w:asciiTheme="minorHAnsi" w:hAnsiTheme="minorHAnsi" w:cstheme="minorHAnsi"/>
-                <w:color w:val="000000" w:themeColor="text1"/>
-                <w:sz w:val="20"/>
-                <w:szCs w:val="20"/>
-              </w:rPr>
-              <w:t xml:space="preserve">Guest speaker: </w:t>
-            </w:r>
-            <w:hyperlink r:id="rId75" w:history="1">
-              <w:r>
-                <w:rPr>
-                  <w:rStyle w:val="Hyperlink"/>
-                  <w:rFonts w:asciiTheme="minorHAnsi" w:hAnsiTheme="minorHAnsi" w:cstheme="minorHAnsi"/>
-                  <w:sz w:val="20"/>
-                  <w:szCs w:val="20"/>
-                </w:rPr>
-                <w:t>Giovanni Marano</w:t>
-              </w:r>
-            </w:hyperlink>
-            <w:r>
-              <w:rPr>
-                <w:rFonts w:asciiTheme="minorHAnsi" w:hAnsiTheme="minorHAnsi" w:cstheme="minorHAnsi"/>
-                <w:color w:val="000000" w:themeColor="text1"/>
-                <w:sz w:val="20"/>
-                <w:szCs w:val="20"/>
-              </w:rPr>
-              <w:t xml:space="preserve"> (FanDuel)</w:t>
             </w:r>
           </w:p>
         </w:tc>

</xml_diff>

<commit_message>
Syllabus: move Oct 22 guest speaker (Hong Zhang) to Thursday, classifiers on Oct 20
Co-Authored-By: Claude Fable 5.1 <noreply@anthropic.com>
</commit_message>
<xml_diff>
--- a/syllabus/mkt566-syllabus-proserpio.docx
+++ b/syllabus/mkt566-syllabus-proserpio.docx
@@ -7132,7 +7132,7 @@
                 <w:sz w:val="20"/>
                 <w:szCs w:val="20"/>
               </w:rPr>
-              <w:t>Guest speaker: Hong Zhang (Marketing Data Science Manager, Netflix)</w:t>
+              <w:t>Classifiers</w:t>
             </w:r>
           </w:p>
           <w:p>
@@ -7155,7 +7155,7 @@
                 <w:sz w:val="20"/>
                 <w:szCs w:val="20"/>
               </w:rPr>
-              <w:t>Classifiers</w:t>
+              <w:t>Guest speaker: Hong Zhang (Marketing Data Science Manager, Netflix)</w:t>
             </w:r>
           </w:p>
           <w:p>

</xml_diff>

<commit_message>
Move clustering to Sept 29 with recommendations; Sept 24 is Airbnb presentations
Co-Authored-By: Claude Opus 5.5 (1M context) <noreply@anthropic.com>
</commit_message>
<xml_diff>
--- a/syllabus/mkt566-syllabus-proserpio.docx
+++ b/syllabus/mkt566-syllabus-proserpio.docx
@@ -6249,7 +6249,143 @@
                 <w:sz w:val="20"/>
                 <w:szCs w:val="20"/>
               </w:rPr>
-              <w:t xml:space="preserve">Clustering</w:t>
+              <w:t xml:space="preserve">In class exercise (Airbnb): presentations</w:t>
+            </w:r>
+          </w:p>
+        </w:tc>
+        <w:tc>
+          <w:tcPr>
+            <w:tcW w:w="2876" w:type="dxa"/>
+          </w:tcPr>
+          <w:p>
+            <w:pPr>
+              <w:rPr>
+                <w:rFonts w:asciiTheme="minorHAnsi" w:hAnsiTheme="minorHAnsi" w:cstheme="minorHAnsi"/>
+                <w:sz w:val="20"/>
+                <w:szCs w:val="20"/>
+              </w:rPr>
+            </w:pPr>
+          </w:p>
+        </w:tc>
+        <w:tc>
+          <w:tcPr>
+            <w:tcW w:w="2836" w:type="dxa"/>
+          </w:tcPr>
+          <w:p>
+            <w:pPr>
+              <w:rPr>
+                <w:rFonts w:asciiTheme="minorHAnsi" w:hAnsiTheme="minorHAnsi" w:cstheme="minorHAnsi"/>
+                <w:color w:val="000000" w:themeColor="text1"/>
+                <w:sz w:val="20"/>
+                <w:szCs w:val="20"/>
+              </w:rPr>
+            </w:pPr>
+          </w:p>
+        </w:tc>
+      </w:tr>
+      <w:tr>
+        <w:trPr>
+          <w:cantSplit/>
+          <w:trHeight w:val="587"/>
+        </w:trPr>
+        <w:tc>
+          <w:tcPr>
+            <w:tcW w:w="1647" w:type="dxa"/>
+          </w:tcPr>
+          <w:p>
+            <w:pPr>
+              <w:pStyle w:val="Heading4"/>
+              <w:rPr>
+                <w:rFonts w:asciiTheme="minorHAnsi" w:hAnsiTheme="minorHAnsi" w:cstheme="minorHAnsi"/>
+                <w:i w:val="0"/>
+                <w:iCs/>
+                <w:color w:val="000000" w:themeColor="text1"/>
+                <w:sz w:val="20"/>
+                <w:szCs w:val="20"/>
+              </w:rPr>
+            </w:pPr>
+            <w:r>
+              <w:rPr>
+                <w:rFonts w:asciiTheme="minorHAnsi" w:hAnsiTheme="minorHAnsi" w:cstheme="minorHAnsi"/>
+                <w:i w:val="0"/>
+                <w:iCs/>
+                <w:color w:val="000000" w:themeColor="text1"/>
+                <w:sz w:val="20"/>
+                <w:szCs w:val="20"/>
+              </w:rPr>
+              <w:t>Week 6</w:t>
+            </w:r>
+          </w:p>
+          <w:p>
+            <w:pPr>
+              <w:rPr>
+                <w:rFonts w:asciiTheme="minorHAnsi" w:hAnsiTheme="minorHAnsi" w:cstheme="minorHAnsi"/>
+                <w:color w:val="000000" w:themeColor="text1"/>
+                <w:sz w:val="20"/>
+                <w:szCs w:val="20"/>
+              </w:rPr>
+            </w:pPr>
+            <w:r>
+              <w:rPr>
+                <w:rFonts w:asciiTheme="minorHAnsi" w:hAnsiTheme="minorHAnsi" w:cstheme="minorHAnsi"/>
+                <w:color w:val="000000" w:themeColor="text1"/>
+                <w:sz w:val="20"/>
+                <w:szCs w:val="20"/>
+              </w:rPr>
+              <w:t>Sept 29, Oct 1</w:t>
+            </w:r>
+          </w:p>
+        </w:tc>
+        <w:tc>
+          <w:tcPr>
+            <w:tcW w:w="2758" w:type="dxa"/>
+          </w:tcPr>
+          <w:p>
+            <w:pPr>
+              <w:pStyle w:val="ListParagraph"/>
+              <w:numPr>
+                <w:ilvl w:val="0"/>
+                <w:numId w:val="33"/>
+              </w:numPr>
+              <w:ind w:left="351" w:hanging="257"/>
+              <w:rPr>
+                <w:rFonts w:asciiTheme="minorHAnsi" w:hAnsiTheme="minorHAnsi" w:cstheme="minorHAnsi"/>
+                <w:color w:val="000000" w:themeColor="text1"/>
+                <w:sz w:val="20"/>
+                <w:szCs w:val="20"/>
+              </w:rPr>
+            </w:pPr>
+            <w:r>
+              <w:rPr>
+                <w:rFonts w:asciiTheme="minorHAnsi" w:hAnsiTheme="minorHAnsi" w:cstheme="minorHAnsi"/>
+                <w:color w:val="000000" w:themeColor="text1"/>
+                <w:sz w:val="20"/>
+                <w:szCs w:val="20"/>
+              </w:rPr>
+              <w:t xml:space="preserve">Clustering; recommendations/personalization</w:t>
+            </w:r>
+          </w:p>
+          <w:p>
+            <w:pPr>
+              <w:pStyle w:val="ListParagraph"/>
+              <w:numPr>
+                <w:ilvl w:val="0"/>
+                <w:numId w:val="33"/>
+              </w:numPr>
+              <w:ind w:left="351" w:hanging="257"/>
+              <w:rPr>
+                <w:rFonts w:asciiTheme="minorHAnsi" w:hAnsiTheme="minorHAnsi" w:cstheme="minorHAnsi"/>
+                <w:sz w:val="20"/>
+                <w:szCs w:val="20"/>
+              </w:rPr>
+            </w:pPr>
+            <w:r>
+              <w:rPr>
+                <w:rFonts w:asciiTheme="minorHAnsi" w:hAnsiTheme="minorHAnsi" w:cstheme="minorHAnsi"/>
+                <w:sz w:val="20"/>
+                <w:szCs w:val="20"/>
+              </w:rPr>
+              <w:t>Clustering/recs.: in class exercise</w:t>
             </w:r>
           </w:p>
         </w:tc>
@@ -6368,198 +6504,6 @@
                 <w:t>Chapter 7 of R for Marketing Students</w:t>
               </w:r>
             </w:hyperlink>
-          </w:p>
-          <w:p>
-            <w:pPr>
-              <w:rPr>
-                <w:rFonts w:asciiTheme="minorHAnsi" w:hAnsiTheme="minorHAnsi" w:cstheme="minorHAnsi"/>
-                <w:sz w:val="20"/>
-                <w:szCs w:val="20"/>
-              </w:rPr>
-            </w:pPr>
-            <w:r>
-              <w:rPr>
-                <w:rFonts w:asciiTheme="minorHAnsi" w:hAnsiTheme="minorHAnsi" w:cstheme="minorHAnsi"/>
-                <w:sz w:val="20"/>
-                <w:szCs w:val="20"/>
-              </w:rPr>
-              <w:t>Optional:</w:t>
-            </w:r>
-          </w:p>
-          <w:p>
-            <w:pPr>
-              <w:pStyle w:val="ListParagraph"/>
-              <w:numPr>
-                <w:ilvl w:val="0"/>
-                <w:numId w:val="33"/>
-              </w:numPr>
-              <w:ind w:hanging="193"/>
-              <w:rPr>
-                <w:rFonts w:asciiTheme="minorHAnsi" w:hAnsiTheme="minorHAnsi" w:cstheme="minorHAnsi"/>
-                <w:sz w:val="20"/>
-                <w:szCs w:val="20"/>
-              </w:rPr>
-            </w:pPr>
-            <w:r>
-              <w:rPr>
-                <w:rFonts w:asciiTheme="minorHAnsi" w:hAnsiTheme="minorHAnsi" w:cstheme="minorHAnsi"/>
-                <w:sz w:val="20"/>
-                <w:szCs w:val="20"/>
-              </w:rPr>
-              <w:t xml:space="preserve">Clustering: </w:t>
-            </w:r>
-            <w:r>
-              <w:rPr>
-                <w:rFonts w:asciiTheme="minorHAnsi" w:hAnsiTheme="minorHAnsi" w:cstheme="minorHAnsi"/>
-                <w:sz w:val="20"/>
-                <w:szCs w:val="20"/>
-              </w:rPr>
-              <w:t>Chapter 11.1–11.3 of R for Marketing Analytics</w:t>
-            </w:r>
-          </w:p>
-        </w:tc>
-        <w:tc>
-          <w:tcPr>
-            <w:tcW w:w="2836" w:type="dxa"/>
-          </w:tcPr>
-          <w:p>
-            <w:pPr>
-              <w:rPr>
-                <w:rFonts w:asciiTheme="minorHAnsi" w:hAnsiTheme="minorHAnsi" w:cstheme="minorHAnsi"/>
-                <w:color w:val="000000" w:themeColor="text1"/>
-                <w:sz w:val="20"/>
-                <w:szCs w:val="20"/>
-              </w:rPr>
-            </w:pPr>
-          </w:p>
-        </w:tc>
-      </w:tr>
-      <w:tr>
-        <w:trPr>
-          <w:cantSplit/>
-          <w:trHeight w:val="587"/>
-        </w:trPr>
-        <w:tc>
-          <w:tcPr>
-            <w:tcW w:w="1647" w:type="dxa"/>
-          </w:tcPr>
-          <w:p>
-            <w:pPr>
-              <w:pStyle w:val="Heading4"/>
-              <w:rPr>
-                <w:rFonts w:asciiTheme="minorHAnsi" w:hAnsiTheme="minorHAnsi" w:cstheme="minorHAnsi"/>
-                <w:i w:val="0"/>
-                <w:iCs/>
-                <w:color w:val="000000" w:themeColor="text1"/>
-                <w:sz w:val="20"/>
-                <w:szCs w:val="20"/>
-              </w:rPr>
-            </w:pPr>
-            <w:r>
-              <w:rPr>
-                <w:rFonts w:asciiTheme="minorHAnsi" w:hAnsiTheme="minorHAnsi" w:cstheme="minorHAnsi"/>
-                <w:i w:val="0"/>
-                <w:iCs/>
-                <w:color w:val="000000" w:themeColor="text1"/>
-                <w:sz w:val="20"/>
-                <w:szCs w:val="20"/>
-              </w:rPr>
-              <w:t>Week 6</w:t>
-            </w:r>
-          </w:p>
-          <w:p>
-            <w:pPr>
-              <w:rPr>
-                <w:rFonts w:asciiTheme="minorHAnsi" w:hAnsiTheme="minorHAnsi" w:cstheme="minorHAnsi"/>
-                <w:color w:val="000000" w:themeColor="text1"/>
-                <w:sz w:val="20"/>
-                <w:szCs w:val="20"/>
-              </w:rPr>
-            </w:pPr>
-            <w:r>
-              <w:rPr>
-                <w:rFonts w:asciiTheme="minorHAnsi" w:hAnsiTheme="minorHAnsi" w:cstheme="minorHAnsi"/>
-                <w:color w:val="000000" w:themeColor="text1"/>
-                <w:sz w:val="20"/>
-                <w:szCs w:val="20"/>
-              </w:rPr>
-              <w:t>Sept 29, Oct 1</w:t>
-            </w:r>
-          </w:p>
-        </w:tc>
-        <w:tc>
-          <w:tcPr>
-            <w:tcW w:w="2758" w:type="dxa"/>
-          </w:tcPr>
-          <w:p>
-            <w:pPr>
-              <w:pStyle w:val="ListParagraph"/>
-              <w:numPr>
-                <w:ilvl w:val="0"/>
-                <w:numId w:val="33"/>
-              </w:numPr>
-              <w:ind w:left="351" w:hanging="257"/>
-              <w:rPr>
-                <w:rFonts w:asciiTheme="minorHAnsi" w:hAnsiTheme="minorHAnsi" w:cstheme="minorHAnsi"/>
-                <w:color w:val="000000" w:themeColor="text1"/>
-                <w:sz w:val="20"/>
-                <w:szCs w:val="20"/>
-              </w:rPr>
-            </w:pPr>
-            <w:r>
-              <w:rPr>
-                <w:rFonts w:asciiTheme="minorHAnsi" w:hAnsiTheme="minorHAnsi" w:cstheme="minorHAnsi"/>
-                <w:color w:val="000000" w:themeColor="text1"/>
-                <w:sz w:val="20"/>
-                <w:szCs w:val="20"/>
-              </w:rPr>
-              <w:t xml:space="preserve">Recommendations/personalization</w:t>
-            </w:r>
-          </w:p>
-          <w:p>
-            <w:pPr>
-              <w:pStyle w:val="ListParagraph"/>
-              <w:numPr>
-                <w:ilvl w:val="0"/>
-                <w:numId w:val="33"/>
-              </w:numPr>
-              <w:ind w:left="351" w:hanging="257"/>
-              <w:rPr>
-                <w:rFonts w:asciiTheme="minorHAnsi" w:hAnsiTheme="minorHAnsi" w:cstheme="minorHAnsi"/>
-                <w:sz w:val="20"/>
-                <w:szCs w:val="20"/>
-              </w:rPr>
-            </w:pPr>
-            <w:r>
-              <w:rPr>
-                <w:rFonts w:asciiTheme="minorHAnsi" w:hAnsiTheme="minorHAnsi" w:cstheme="minorHAnsi"/>
-                <w:sz w:val="20"/>
-                <w:szCs w:val="20"/>
-              </w:rPr>
-              <w:t>Clustering/recs.: in class exercise</w:t>
-            </w:r>
-          </w:p>
-        </w:tc>
-        <w:tc>
-          <w:tcPr>
-            <w:tcW w:w="2876" w:type="dxa"/>
-          </w:tcPr>
-          <w:p>
-            <w:pPr>
-              <w:rPr>
-                <w:rFonts w:asciiTheme="minorHAnsi" w:hAnsiTheme="minorHAnsi" w:cstheme="minorHAnsi"/>
-                <w:sz w:val="20"/>
-                <w:szCs w:val="20"/>
-              </w:rPr>
-            </w:pPr>
-            <w:r>
-              <w:rPr>
-                <w:rFonts w:asciiTheme="minorHAnsi" w:hAnsiTheme="minorHAnsi" w:cstheme="minorHAnsi"/>
-                <w:sz w:val="20"/>
-                <w:szCs w:val="20"/>
-              </w:rPr>
-              <w:t>Required:</w:t>
-            </w:r>
           </w:p>
           <w:p>
             <w:pPr>
@@ -6645,6 +6589,37 @@
                 <w:szCs w:val="20"/>
               </w:rPr>
               <w:t>Optional:</w:t>
+            </w:r>
+          </w:p>
+          <w:p>
+            <w:pPr>
+              <w:pStyle w:val="ListParagraph"/>
+              <w:numPr>
+                <w:ilvl w:val="0"/>
+                <w:numId w:val="33"/>
+              </w:numPr>
+              <w:ind w:hanging="193"/>
+              <w:rPr>
+                <w:rFonts w:asciiTheme="minorHAnsi" w:hAnsiTheme="minorHAnsi" w:cstheme="minorHAnsi"/>
+                <w:sz w:val="20"/>
+                <w:szCs w:val="20"/>
+              </w:rPr>
+            </w:pPr>
+            <w:r>
+              <w:rPr>
+                <w:rFonts w:asciiTheme="minorHAnsi" w:hAnsiTheme="minorHAnsi" w:cstheme="minorHAnsi"/>
+                <w:sz w:val="20"/>
+                <w:szCs w:val="20"/>
+              </w:rPr>
+              <w:t xml:space="preserve">Clustering: </w:t>
+            </w:r>
+            <w:r>
+              <w:rPr>
+                <w:rFonts w:asciiTheme="minorHAnsi" w:hAnsiTheme="minorHAnsi" w:cstheme="minorHAnsi"/>
+                <w:sz w:val="20"/>
+                <w:szCs w:val="20"/>
+              </w:rPr>
+              <w:t>Chapter 11.1–11.3 of R for Marketing Analytics</w:t>
             </w:r>
           </w:p>
           <w:p>

</xml_diff>

<commit_message>
Week 6: clustering and recommendations decks, clustering exercise; week 7 is fall recess
- Move the clustering material from w5 to w6 (w5- files renamed w6-) and
  rework the deck: no code, a 7-step segmentation roadmap, a k-means
  step-through, a simpler PCA section, a closing steps slide
- New recommendation systems deck (Oct. 1), adapted from the 2025 deck
- Clustering practice exercise (handout, Rmd template, data)
- Syllabus: week 7 is fall recess only
- README: week 6 and week 7

Co-Authored-By: Claude Opus 5.5 <noreply@anthropic.com>
</commit_message>
<xml_diff>
--- a/syllabus/mkt566-syllabus-proserpio.docx
+++ b/syllabus/mkt566-syllabus-proserpio.docx
@@ -6751,29 +6751,6 @@
           <w:tcPr>
             <w:tcW w:w="2758" w:type="dxa"/>
           </w:tcPr>
-          <w:p>
-            <w:pPr>
-              <w:pStyle w:val="ListParagraph"/>
-              <w:numPr>
-                <w:ilvl w:val="0"/>
-                <w:numId w:val="33"/>
-              </w:numPr>
-              <w:ind w:left="299" w:hanging="180"/>
-              <w:rPr>
-                <w:rFonts w:asciiTheme="minorHAnsi" w:hAnsiTheme="minorHAnsi" w:cstheme="minorHAnsi"/>
-                <w:sz w:val="20"/>
-                <w:szCs w:val="20"/>
-              </w:rPr>
-            </w:pPr>
-            <w:r>
-              <w:rPr>
-                <w:rFonts w:asciiTheme="minorHAnsi" w:hAnsiTheme="minorHAnsi" w:cstheme="minorHAnsi"/>
-                <w:sz w:val="20"/>
-                <w:szCs w:val="20"/>
-              </w:rPr>
-              <w:t>Work on group project</w:t>
-            </w:r>
-          </w:p>
           <w:p>
             <w:pPr>
               <w:pStyle w:val="ListParagraph"/>

</xml_diff>

<commit_message>
Syllabus: shift weeks 10-14 (classifier mini-project, text analysis Nov 3, causality Nov 10-17, LLMs Nov 19, HW4 Nov 3 to Nov 24)
Co-Authored-By: Claude Fable 5 <noreply@anthropic.com>
</commit_message>
<xml_diff>
--- a/syllabus/mkt566-syllabus-proserpio.docx
+++ b/syllabus/mkt566-syllabus-proserpio.docx
@@ -7262,7 +7262,7 @@
                 <w:sz w:val="20"/>
                 <w:szCs w:val="20"/>
               </w:rPr>
-              <w:t>User-generated content, text analysis, and sentiment prediction</w:t>
+              <w:t xml:space="preserve">Classifier mini-project: predicting ad clicks</w:t>
             </w:r>
           </w:p>
           <w:p>
@@ -7285,7 +7285,171 @@
                 <w:sz w:val="20"/>
                 <w:szCs w:val="20"/>
               </w:rPr>
-              <w:t>User-generated content, text analysis, and sentiment prediction</w:t>
+              <w:t xml:space="preserve">Classifier mini-project: group presentations</w:t>
+            </w:r>
+          </w:p>
+        </w:tc>
+        <w:tc>
+          <w:tcPr>
+            <w:tcW w:w="2876" w:type="dxa"/>
+          </w:tcPr>
+          <w:p>
+            <w:pPr>
+              <w:rPr>
+                <w:rFonts w:asciiTheme="minorHAnsi" w:hAnsiTheme="minorHAnsi" w:cstheme="minorHAnsi"/>
+                <w:sz w:val="20"/>
+                <w:szCs w:val="20"/>
+              </w:rPr>
+            </w:pPr>
+          </w:p>
+        </w:tc>
+        <w:tc>
+          <w:tcPr>
+            <w:tcW w:w="2836" w:type="dxa"/>
+          </w:tcPr>
+          <w:p>
+            <w:pPr>
+              <w:rPr>
+                <w:rFonts w:asciiTheme="minorHAnsi" w:hAnsiTheme="minorHAnsi" w:cstheme="minorHAnsi"/>
+                <w:color w:val="000000" w:themeColor="text1"/>
+                <w:sz w:val="20"/>
+                <w:szCs w:val="20"/>
+              </w:rPr>
+            </w:pPr>
+            <w:r>
+              <w:rPr>
+                <w:rFonts w:asciiTheme="minorHAnsi" w:hAnsiTheme="minorHAnsi" w:cstheme="minorHAnsi"/>
+                <w:color w:val="000000" w:themeColor="text1"/>
+                <w:sz w:val="20"/>
+                <w:szCs w:val="20"/>
+              </w:rPr>
+              <w:t>Homework 3 due on Oct. 29</w:t>
+            </w:r>
+          </w:p>
+        </w:tc>
+      </w:tr>
+      <w:tr>
+        <w:trPr>
+          <w:cantSplit/>
+          <w:trHeight w:val="587"/>
+        </w:trPr>
+        <w:tc>
+          <w:tcPr>
+            <w:tcW w:w="1647" w:type="dxa"/>
+          </w:tcPr>
+          <w:p>
+            <w:pPr>
+              <w:pStyle w:val="Heading4"/>
+              <w:rPr>
+                <w:rFonts w:asciiTheme="minorHAnsi" w:hAnsiTheme="minorHAnsi" w:cstheme="minorHAnsi"/>
+                <w:i w:val="0"/>
+                <w:iCs/>
+                <w:color w:val="000000" w:themeColor="text1"/>
+                <w:sz w:val="20"/>
+                <w:szCs w:val="20"/>
+              </w:rPr>
+            </w:pPr>
+            <w:r>
+              <w:rPr>
+                <w:rFonts w:asciiTheme="minorHAnsi" w:hAnsiTheme="minorHAnsi" w:cstheme="minorHAnsi"/>
+                <w:i w:val="0"/>
+                <w:iCs/>
+                <w:color w:val="000000" w:themeColor="text1"/>
+                <w:sz w:val="20"/>
+                <w:szCs w:val="20"/>
+              </w:rPr>
+              <w:t>Week 11</w:t>
+            </w:r>
+          </w:p>
+          <w:p>
+            <w:pPr>
+              <w:rPr>
+                <w:rFonts w:asciiTheme="minorHAnsi" w:hAnsiTheme="minorHAnsi" w:cstheme="minorHAnsi"/>
+                <w:color w:val="000000" w:themeColor="text1"/>
+                <w:sz w:val="20"/>
+                <w:szCs w:val="20"/>
+              </w:rPr>
+            </w:pPr>
+            <w:r>
+              <w:rPr>
+                <w:rFonts w:asciiTheme="minorHAnsi" w:hAnsiTheme="minorHAnsi" w:cstheme="minorHAnsi"/>
+                <w:color w:val="000000" w:themeColor="text1"/>
+                <w:sz w:val="20"/>
+                <w:szCs w:val="20"/>
+              </w:rPr>
+              <w:t>Nov 3, 5</w:t>
+            </w:r>
+          </w:p>
+        </w:tc>
+        <w:tc>
+          <w:tcPr>
+            <w:tcW w:w="2758" w:type="dxa"/>
+          </w:tcPr>
+          <w:p>
+            <w:pPr>
+              <w:pStyle w:val="ListParagraph"/>
+              <w:numPr>
+                <w:ilvl w:val="0"/>
+                <w:numId w:val="33"/>
+              </w:numPr>
+              <w:ind w:left="261" w:hanging="180"/>
+              <w:rPr>
+                <w:rFonts w:asciiTheme="minorHAnsi" w:hAnsiTheme="minorHAnsi" w:cstheme="minorHAnsi"/>
+                <w:sz w:val="20"/>
+                <w:szCs w:val="20"/>
+              </w:rPr>
+            </w:pPr>
+            <w:r>
+              <w:rPr>
+                <w:rFonts w:asciiTheme="minorHAnsi" w:hAnsiTheme="minorHAnsi" w:cstheme="minorHAnsi"/>
+                <w:sz w:val="20"/>
+                <w:szCs w:val="20"/>
+              </w:rPr>
+              <w:t xml:space="preserve">User-generated content, text analysis, and sentiment prediction</w:t>
+            </w:r>
+          </w:p>
+          <w:p>
+            <w:pPr>
+              <w:pStyle w:val="ListParagraph"/>
+              <w:numPr>
+                <w:ilvl w:val="0"/>
+                <w:numId w:val="33"/>
+              </w:numPr>
+              <w:ind w:left="261" w:hanging="180"/>
+              <w:rPr>
+                <w:rFonts w:asciiTheme="minorHAnsi" w:hAnsiTheme="minorHAnsi" w:cstheme="minorHAnsi"/>
+                <w:sz w:val="20"/>
+                <w:szCs w:val="20"/>
+              </w:rPr>
+            </w:pPr>
+            <w:r>
+              <w:rPr>
+                <w:rFonts w:asciiTheme="minorHAnsi" w:hAnsiTheme="minorHAnsi" w:cstheme="minorHAnsi"/>
+                <w:color w:val="000000" w:themeColor="text1"/>
+                <w:sz w:val="20"/>
+                <w:szCs w:val="20"/>
+              </w:rPr>
+              <w:t xml:space="preserve">Guest speaker: </w:t>
+            </w:r>
+            <w:hyperlink r:id="rId74" w:history="1">
+              <w:r>
+                <w:rPr>
+                  <w:rStyle w:val="Hyperlink"/>
+                  <w:rFonts w:asciiTheme="minorHAnsi" w:hAnsiTheme="minorHAnsi" w:cstheme="minorHAnsi"/>
+                  <w:sz w:val="20"/>
+                  <w:szCs w:val="20"/>
+                </w:rPr>
+                <w:t>Andrea Ciufo</w:t>
+              </w:r>
+            </w:hyperlink>
+            <w:r>
+              <w:rPr>
+                <w:rFonts w:asciiTheme="minorHAnsi" w:hAnsiTheme="minorHAnsi" w:cstheme="minorHAnsi"/>
+                <w:color w:val="000000" w:themeColor="text1"/>
+                <w:sz w:val="20"/>
+                <w:szCs w:val="20"/>
+              </w:rPr>
+              <w:t xml:space="preserve"> (dentsu)</w:t>
             </w:r>
           </w:p>
         </w:tc>
@@ -7406,56 +7570,6 @@
                 <w:ilvl w:val="0"/>
                 <w:numId w:val="33"/>
               </w:numPr>
-              <w:ind w:hanging="204"/>
-              <w:rPr>
-                <w:rFonts w:asciiTheme="minorHAnsi" w:eastAsia="Times New Roman" w:hAnsiTheme="minorHAnsi" w:cstheme="minorHAnsi"/>
-                <w:sz w:val="20"/>
-                <w:szCs w:val="20"/>
-              </w:rPr>
-            </w:pPr>
-            <w:hyperlink r:id="rId39" w:history="1">
-              <w:r>
-                <w:rPr>
-                  <w:rStyle w:val="Hyperlink"/>
-                  <w:rFonts w:eastAsia="Times New Roman"/>
-                  <w:sz w:val="20"/>
-                  <w:szCs w:val="20"/>
-                </w:rPr>
-                <w:t xml:space="preserve">GLMNET </w:t>
-              </w:r>
-              <w:r>
-                <w:rPr>
-                  <w:rStyle w:val="Hyperlink"/>
-                  <w:rFonts w:eastAsia="Times New Roman"/>
-                  <w:sz w:val="20"/>
-                  <w:szCs w:val="20"/>
-                </w:rPr>
-                <w:t>R</w:t>
-              </w:r>
-              <w:r>
-                <w:rPr>
-                  <w:rStyle w:val="Hyperlink"/>
-                </w:rPr>
-                <w:t xml:space="preserve"> </w:t>
-              </w:r>
-              <w:r>
-                <w:rPr>
-                  <w:rStyle w:val="Hyperlink"/>
-                  <w:rFonts w:eastAsia="Times New Roman"/>
-                  <w:sz w:val="20"/>
-                  <w:szCs w:val="20"/>
-                </w:rPr>
-                <w:t>package</w:t>
-              </w:r>
-            </w:hyperlink>
-          </w:p>
-          <w:p>
-            <w:pPr>
-              <w:widowControl w:val="0"/>
-              <w:numPr>
-                <w:ilvl w:val="0"/>
-                <w:numId w:val="33"/>
-              </w:numPr>
               <w:spacing w:line="276" w:lineRule="auto"/>
               <w:ind w:hanging="204"/>
               <w:rPr>
@@ -7636,89 +7750,7 @@
                 <w:sz w:val="20"/>
                 <w:szCs w:val="20"/>
               </w:rPr>
-              <w:t>Homework 3 due on Oct. 29</w:t>
-            </w:r>
-          </w:p>
-          <w:p>
-            <w:pPr>
-              <w:rPr>
-                <w:rFonts w:asciiTheme="minorHAnsi" w:hAnsiTheme="minorHAnsi" w:cstheme="minorHAnsi"/>
-                <w:color w:val="000000" w:themeColor="text1"/>
-                <w:sz w:val="20"/>
-                <w:szCs w:val="20"/>
-              </w:rPr>
-            </w:pPr>
-            <w:r>
-              <w:rPr>
-                <w:rFonts w:asciiTheme="minorHAnsi" w:hAnsiTheme="minorHAnsi" w:cstheme="minorHAnsi"/>
-                <w:color w:val="000000" w:themeColor="text1"/>
-                <w:sz w:val="20"/>
-                <w:szCs w:val="20"/>
-              </w:rPr>
-              <w:t>Homework 4</w:t>
-            </w:r>
-            <w:r>
-              <w:rPr>
-                <w:rFonts w:asciiTheme="minorHAnsi" w:hAnsiTheme="minorHAnsi" w:cstheme="minorHAnsi"/>
-                <w:color w:val="000000" w:themeColor="text1"/>
-                <w:sz w:val="20"/>
-                <w:szCs w:val="20"/>
-              </w:rPr>
-              <w:t xml:space="preserve">: </w:t>
-            </w:r>
-            <w:r>
-              <w:rPr>
-                <w:rFonts w:asciiTheme="minorHAnsi" w:hAnsiTheme="minorHAnsi" w:cstheme="minorHAnsi"/>
-                <w:color w:val="000000" w:themeColor="text1"/>
-                <w:sz w:val="20"/>
-                <w:szCs w:val="20"/>
-              </w:rPr>
-              <w:t xml:space="preserve">Predictions </w:t>
-            </w:r>
-            <w:r>
-              <w:rPr>
-                <w:rFonts w:asciiTheme="minorHAnsi" w:hAnsiTheme="minorHAnsi" w:cstheme="minorHAnsi"/>
-                <w:color w:val="000000" w:themeColor="text1"/>
-                <w:sz w:val="20"/>
-                <w:szCs w:val="20"/>
-              </w:rPr>
-              <w:t>(release date: Oct</w:t>
-            </w:r>
-            <w:r>
-              <w:rPr>
-                <w:rFonts w:asciiTheme="minorHAnsi" w:hAnsiTheme="minorHAnsi" w:cstheme="minorHAnsi"/>
-                <w:color w:val="000000" w:themeColor="text1"/>
-                <w:sz w:val="20"/>
-                <w:szCs w:val="20"/>
-              </w:rPr>
-              <w:t>.</w:t>
-            </w:r>
-            <w:r>
-              <w:rPr>
-                <w:rFonts w:asciiTheme="minorHAnsi" w:hAnsiTheme="minorHAnsi" w:cstheme="minorHAnsi"/>
-                <w:color w:val="000000" w:themeColor="text1"/>
-                <w:sz w:val="20"/>
-                <w:szCs w:val="20"/>
-              </w:rPr>
-              <w:t xml:space="preserve"> 2</w:t>
-            </w:r>
-            <w:r>
-              <w:rPr>
-                <w:rFonts w:asciiTheme="minorHAnsi" w:hAnsiTheme="minorHAnsi" w:cstheme="minorHAnsi"/>
-                <w:color w:val="000000" w:themeColor="text1"/>
-                <w:sz w:val="20"/>
-                <w:szCs w:val="20"/>
-              </w:rPr>
-              <w:t>9</w:t>
-            </w:r>
-            <w:r>
-              <w:rPr>
-                <w:rFonts w:asciiTheme="minorHAnsi" w:hAnsiTheme="minorHAnsi" w:cstheme="minorHAnsi"/>
-                <w:color w:val="000000" w:themeColor="text1"/>
-                <w:sz w:val="20"/>
-                <w:szCs w:val="20"/>
-              </w:rPr>
-              <w:t>)</w:t>
+              <w:t xml:space="preserve">Homework 4: Predictions (release date: Nov. 3)</w:t>
             </w:r>
           </w:p>
         </w:tc>
@@ -7753,7 +7785,7 @@
                 <w:sz w:val="20"/>
                 <w:szCs w:val="20"/>
               </w:rPr>
-              <w:t>Week 11</w:t>
+              <w:t>Week 12</w:t>
             </w:r>
           </w:p>
           <w:p>
@@ -7772,7 +7804,7 @@
                 <w:sz w:val="20"/>
                 <w:szCs w:val="20"/>
               </w:rPr>
-              <w:t>Nov 3, 5</w:t>
+              <w:t>Nov 10, 12</w:t>
             </w:r>
           </w:p>
         </w:tc>
@@ -7800,15 +7832,7 @@
                 <w:sz w:val="20"/>
                 <w:szCs w:val="20"/>
               </w:rPr>
-              <w:t xml:space="preserve">Causality: </w:t>
-            </w:r>
-            <w:r>
-              <w:rPr>
-                <w:rFonts w:asciiTheme="minorHAnsi" w:hAnsiTheme="minorHAnsi" w:cstheme="minorHAnsi"/>
-                <w:sz w:val="20"/>
-                <w:szCs w:val="20"/>
-              </w:rPr>
-              <w:t>Randomized experiments and ad measurements</w:t>
+              <w:t xml:space="preserve">Causality: Randomized experiments and ad measurements</w:t>
             </w:r>
           </w:p>
           <w:p>
@@ -7828,31 +7852,10 @@
             <w:r>
               <w:rPr>
                 <w:rFonts w:asciiTheme="minorHAnsi" w:hAnsiTheme="minorHAnsi" w:cstheme="minorHAnsi"/>
-                <w:color w:val="000000" w:themeColor="text1"/>
-                <w:sz w:val="20"/>
-                <w:szCs w:val="20"/>
-              </w:rPr>
-              <w:t xml:space="preserve">Guest speaker: </w:t>
-            </w:r>
-            <w:hyperlink r:id="rId74" w:history="1">
-              <w:r>
-                <w:rPr>
-                  <w:rStyle w:val="Hyperlink"/>
-                  <w:rFonts w:asciiTheme="minorHAnsi" w:hAnsiTheme="minorHAnsi" w:cstheme="minorHAnsi"/>
-                  <w:sz w:val="20"/>
-                  <w:szCs w:val="20"/>
-                </w:rPr>
-                <w:t>Andrea Ciufo</w:t>
-              </w:r>
-            </w:hyperlink>
-            <w:r>
-              <w:rPr>
-                <w:rFonts w:asciiTheme="minorHAnsi" w:hAnsiTheme="minorHAnsi" w:cstheme="minorHAnsi"/>
-                <w:color w:val="000000" w:themeColor="text1"/>
-                <w:sz w:val="20"/>
-                <w:szCs w:val="20"/>
-              </w:rPr>
-              <w:t xml:space="preserve"> (dentsu)</w:t>
+                <w:sz w:val="20"/>
+                <w:szCs w:val="20"/>
+              </w:rPr>
+              <w:t>Causality: Observational data</w:t>
             </w:r>
           </w:p>
         </w:tc>
@@ -7874,7 +7877,7 @@
                 <w:sz w:val="20"/>
                 <w:szCs w:val="20"/>
               </w:rPr>
-              <w:t>Required:</w:t>
+              <w:t xml:space="preserve">Required: </w:t>
             </w:r>
           </w:p>
           <w:p>
@@ -7928,213 +7931,6 @@
                 <w:t>What is the difference between attribution vs. incrementality?</w:t>
               </w:r>
             </w:hyperlink>
-          </w:p>
-          <w:p>
-            <w:pPr>
-              <w:rPr>
-                <w:rFonts w:asciiTheme="minorHAnsi" w:hAnsiTheme="minorHAnsi" w:cstheme="minorHAnsi"/>
-                <w:sz w:val="20"/>
-                <w:szCs w:val="20"/>
-              </w:rPr>
-            </w:pPr>
-            <w:r>
-              <w:rPr>
-                <w:rFonts w:asciiTheme="minorHAnsi" w:hAnsiTheme="minorHAnsi" w:cstheme="minorHAnsi"/>
-                <w:sz w:val="20"/>
-                <w:szCs w:val="20"/>
-              </w:rPr>
-              <w:lastRenderedPageBreak/>
-              <w:t>Optional</w:t>
-            </w:r>
-            <w:r>
-              <w:rPr>
-                <w:rFonts w:asciiTheme="minorHAnsi" w:hAnsiTheme="minorHAnsi" w:cstheme="minorHAnsi"/>
-                <w:sz w:val="20"/>
-                <w:szCs w:val="20"/>
-              </w:rPr>
-              <w:t>:</w:t>
-            </w:r>
-          </w:p>
-          <w:p>
-            <w:pPr>
-              <w:pStyle w:val="ListParagraph"/>
-              <w:numPr>
-                <w:ilvl w:val="0"/>
-                <w:numId w:val="33"/>
-              </w:numPr>
-              <w:ind w:hanging="204"/>
-              <w:rPr>
-                <w:rFonts w:asciiTheme="minorHAnsi" w:hAnsiTheme="minorHAnsi" w:cstheme="minorHAnsi"/>
-                <w:color w:val="0000FF"/>
-                <w:sz w:val="20"/>
-                <w:szCs w:val="20"/>
-                <w:u w:val="single"/>
-              </w:rPr>
-            </w:pPr>
-            <w:hyperlink r:id="rId47" w:history="1">
-              <w:r>
-                <w:rPr>
-                  <w:rStyle w:val="Hyperlink"/>
-                  <w:rFonts w:asciiTheme="minorHAnsi" w:hAnsiTheme="minorHAnsi" w:cstheme="minorHAnsi"/>
-                  <w:sz w:val="20"/>
-                  <w:szCs w:val="20"/>
-                </w:rPr>
-                <w:t>Retail Media ROAS Demystified</w:t>
-              </w:r>
-            </w:hyperlink>
-          </w:p>
-          <w:p>
-            <w:pPr>
-              <w:pStyle w:val="ListParagraph"/>
-              <w:ind w:left="360"/>
-              <w:rPr>
-                <w:rFonts w:asciiTheme="minorHAnsi" w:hAnsiTheme="minorHAnsi" w:cstheme="minorHAnsi"/>
-                <w:sz w:val="20"/>
-                <w:szCs w:val="20"/>
-              </w:rPr>
-            </w:pPr>
-          </w:p>
-        </w:tc>
-        <w:tc>
-          <w:tcPr>
-            <w:tcW w:w="2836" w:type="dxa"/>
-          </w:tcPr>
-          <w:p>
-            <w:pPr>
-              <w:rPr>
-                <w:rFonts w:asciiTheme="minorHAnsi" w:hAnsiTheme="minorHAnsi" w:cstheme="minorHAnsi"/>
-                <w:color w:val="000000" w:themeColor="text1"/>
-                <w:sz w:val="20"/>
-                <w:szCs w:val="20"/>
-              </w:rPr>
-            </w:pPr>
-          </w:p>
-        </w:tc>
-      </w:tr>
-      <w:tr>
-        <w:trPr>
-          <w:cantSplit/>
-          <w:trHeight w:val="587"/>
-        </w:trPr>
-        <w:tc>
-          <w:tcPr>
-            <w:tcW w:w="1647" w:type="dxa"/>
-          </w:tcPr>
-          <w:p>
-            <w:pPr>
-              <w:pStyle w:val="Heading4"/>
-              <w:rPr>
-                <w:rFonts w:asciiTheme="minorHAnsi" w:hAnsiTheme="minorHAnsi" w:cstheme="minorHAnsi"/>
-                <w:i w:val="0"/>
-                <w:iCs/>
-                <w:color w:val="000000" w:themeColor="text1"/>
-                <w:sz w:val="20"/>
-                <w:szCs w:val="20"/>
-              </w:rPr>
-            </w:pPr>
-            <w:r>
-              <w:rPr>
-                <w:rFonts w:asciiTheme="minorHAnsi" w:hAnsiTheme="minorHAnsi" w:cstheme="minorHAnsi"/>
-                <w:i w:val="0"/>
-                <w:iCs/>
-                <w:color w:val="000000" w:themeColor="text1"/>
-                <w:sz w:val="20"/>
-                <w:szCs w:val="20"/>
-              </w:rPr>
-              <w:t>Week 12</w:t>
-            </w:r>
-          </w:p>
-          <w:p>
-            <w:pPr>
-              <w:rPr>
-                <w:rFonts w:asciiTheme="minorHAnsi" w:hAnsiTheme="minorHAnsi" w:cstheme="minorHAnsi"/>
-                <w:color w:val="000000" w:themeColor="text1"/>
-                <w:sz w:val="20"/>
-                <w:szCs w:val="20"/>
-              </w:rPr>
-            </w:pPr>
-            <w:r>
-              <w:rPr>
-                <w:rFonts w:asciiTheme="minorHAnsi" w:hAnsiTheme="minorHAnsi" w:cstheme="minorHAnsi"/>
-                <w:color w:val="000000" w:themeColor="text1"/>
-                <w:sz w:val="20"/>
-                <w:szCs w:val="20"/>
-              </w:rPr>
-              <w:t>Nov 10, 12</w:t>
-            </w:r>
-          </w:p>
-        </w:tc>
-        <w:tc>
-          <w:tcPr>
-            <w:tcW w:w="2758" w:type="dxa"/>
-          </w:tcPr>
-          <w:p>
-            <w:pPr>
-              <w:pStyle w:val="ListParagraph"/>
-              <w:numPr>
-                <w:ilvl w:val="0"/>
-                <w:numId w:val="33"/>
-              </w:numPr>
-              <w:ind w:left="261" w:hanging="180"/>
-              <w:rPr>
-                <w:rFonts w:asciiTheme="minorHAnsi" w:hAnsiTheme="minorHAnsi" w:cstheme="minorHAnsi"/>
-                <w:sz w:val="20"/>
-                <w:szCs w:val="20"/>
-              </w:rPr>
-            </w:pPr>
-            <w:r>
-              <w:rPr>
-                <w:rFonts w:asciiTheme="minorHAnsi" w:hAnsiTheme="minorHAnsi" w:cstheme="minorHAnsi"/>
-                <w:sz w:val="20"/>
-                <w:szCs w:val="20"/>
-              </w:rPr>
-              <w:t>Causality: Observational data</w:t>
-            </w:r>
-          </w:p>
-          <w:p>
-            <w:pPr>
-              <w:pStyle w:val="ListParagraph"/>
-              <w:numPr>
-                <w:ilvl w:val="0"/>
-                <w:numId w:val="33"/>
-              </w:numPr>
-              <w:ind w:left="261" w:hanging="180"/>
-              <w:rPr>
-                <w:rFonts w:asciiTheme="minorHAnsi" w:hAnsiTheme="minorHAnsi" w:cstheme="minorHAnsi"/>
-                <w:sz w:val="20"/>
-                <w:szCs w:val="20"/>
-              </w:rPr>
-            </w:pPr>
-            <w:r>
-              <w:rPr>
-                <w:rFonts w:asciiTheme="minorHAnsi" w:hAnsiTheme="minorHAnsi" w:cstheme="minorHAnsi"/>
-                <w:sz w:val="20"/>
-                <w:szCs w:val="20"/>
-              </w:rPr>
-              <w:t>Causality: Observational data</w:t>
-            </w:r>
-          </w:p>
-        </w:tc>
-        <w:tc>
-          <w:tcPr>
-            <w:tcW w:w="2876" w:type="dxa"/>
-          </w:tcPr>
-          <w:p>
-            <w:pPr>
-              <w:rPr>
-                <w:rFonts w:asciiTheme="minorHAnsi" w:hAnsiTheme="minorHAnsi" w:cstheme="minorHAnsi"/>
-                <w:sz w:val="20"/>
-                <w:szCs w:val="20"/>
-              </w:rPr>
-            </w:pPr>
-            <w:r>
-              <w:rPr>
-                <w:rFonts w:asciiTheme="minorHAnsi" w:hAnsiTheme="minorHAnsi" w:cstheme="minorHAnsi"/>
-                <w:sz w:val="20"/>
-                <w:szCs w:val="20"/>
-              </w:rPr>
-              <w:t xml:space="preserve">Required: </w:t>
-            </w:r>
           </w:p>
           <w:p>
             <w:pPr>
@@ -8203,6 +7999,60 @@
               </w:r>
             </w:hyperlink>
           </w:p>
+          <w:p>
+            <w:pPr>
+              <w:rPr>
+                <w:rFonts w:asciiTheme="minorHAnsi" w:hAnsiTheme="minorHAnsi" w:cstheme="minorHAnsi"/>
+                <w:sz w:val="20"/>
+                <w:szCs w:val="20"/>
+              </w:rPr>
+            </w:pPr>
+            <w:r>
+              <w:rPr>
+                <w:rFonts w:asciiTheme="minorHAnsi" w:hAnsiTheme="minorHAnsi" w:cstheme="minorHAnsi"/>
+                <w:sz w:val="20"/>
+                <w:szCs w:val="20"/>
+              </w:rPr>
+              <w:lastRenderedPageBreak/>
+              <w:t>Optional</w:t>
+            </w:r>
+            <w:r>
+              <w:rPr>
+                <w:rFonts w:asciiTheme="minorHAnsi" w:hAnsiTheme="minorHAnsi" w:cstheme="minorHAnsi"/>
+                <w:sz w:val="20"/>
+                <w:szCs w:val="20"/>
+              </w:rPr>
+              <w:t>:</w:t>
+            </w:r>
+          </w:p>
+          <w:p>
+            <w:pPr>
+              <w:pStyle w:val="ListParagraph"/>
+              <w:numPr>
+                <w:ilvl w:val="0"/>
+                <w:numId w:val="33"/>
+              </w:numPr>
+              <w:ind w:hanging="204"/>
+              <w:rPr>
+                <w:rFonts w:asciiTheme="minorHAnsi" w:hAnsiTheme="minorHAnsi" w:cstheme="minorHAnsi"/>
+                <w:color w:val="0000FF"/>
+                <w:sz w:val="20"/>
+                <w:szCs w:val="20"/>
+                <w:u w:val="single"/>
+              </w:rPr>
+            </w:pPr>
+            <w:hyperlink r:id="rId47" w:history="1">
+              <w:r>
+                <w:rPr>
+                  <w:rStyle w:val="Hyperlink"/>
+                  <w:rFonts w:asciiTheme="minorHAnsi" w:hAnsiTheme="minorHAnsi" w:cstheme="minorHAnsi"/>
+                  <w:sz w:val="20"/>
+                  <w:szCs w:val="20"/>
+                </w:rPr>
+                <w:t>Retail Media ROAS Demystified</w:t>
+              </w:r>
+            </w:hyperlink>
+          </w:p>
         </w:tc>
         <w:tc>
           <w:tcPr>
@@ -8277,6 +8127,29 @@
           <w:tcPr>
             <w:tcW w:w="2758" w:type="dxa"/>
           </w:tcPr>
+          <w:p>
+            <w:pPr>
+              <w:pStyle w:val="ListParagraph"/>
+              <w:numPr>
+                <w:ilvl w:val="0"/>
+                <w:numId w:val="33"/>
+              </w:numPr>
+              <w:ind w:left="261" w:hanging="180"/>
+              <w:rPr>
+                <w:rFonts w:asciiTheme="minorHAnsi" w:hAnsiTheme="minorHAnsi" w:cstheme="minorHAnsi"/>
+                <w:sz w:val="20"/>
+                <w:szCs w:val="20"/>
+              </w:rPr>
+            </w:pPr>
+            <w:r>
+              <w:rPr>
+                <w:rFonts w:asciiTheme="minorHAnsi" w:hAnsiTheme="minorHAnsi" w:cstheme="minorHAnsi"/>
+                <w:sz w:val="20"/>
+                <w:szCs w:val="20"/>
+              </w:rPr>
+              <w:t xml:space="preserve">Causality: Observational data (cont.)</w:t>
+            </w:r>
+          </w:p>
           <w:p>
             <w:pPr>
               <w:pStyle w:val="ListParagraph"/>
@@ -8397,42 +8270,6 @@
                 <w:szCs w:val="20"/>
               </w:rPr>
             </w:pPr>
-            <w:r>
-              <w:rPr>
-                <w:rFonts w:asciiTheme="minorHAnsi" w:hAnsiTheme="minorHAnsi" w:cstheme="minorHAnsi"/>
-                <w:color w:val="000000" w:themeColor="text1"/>
-                <w:sz w:val="20"/>
-                <w:szCs w:val="20"/>
-              </w:rPr>
-              <w:t>Homework 4 due on No</w:t>
-            </w:r>
-            <w:r>
-              <w:rPr>
-                <w:rFonts w:asciiTheme="minorHAnsi" w:hAnsiTheme="minorHAnsi" w:cstheme="minorHAnsi"/>
-                <w:color w:val="000000" w:themeColor="text1"/>
-                <w:sz w:val="20"/>
-                <w:szCs w:val="20"/>
-              </w:rPr>
-              <w:t>v.</w:t>
-            </w:r>
-            <w:r>
-              <w:rPr>
-                <w:rFonts w:asciiTheme="minorHAnsi" w:hAnsiTheme="minorHAnsi" w:cstheme="minorHAnsi"/>
-                <w:color w:val="000000" w:themeColor="text1"/>
-                <w:sz w:val="20"/>
-                <w:szCs w:val="20"/>
-              </w:rPr>
-              <w:t xml:space="preserve"> 1</w:t>
-            </w:r>
-            <w:r>
-              <w:rPr>
-                <w:rFonts w:asciiTheme="minorHAnsi" w:hAnsiTheme="minorHAnsi" w:cstheme="minorHAnsi"/>
-                <w:color w:val="000000" w:themeColor="text1"/>
-                <w:sz w:val="20"/>
-                <w:szCs w:val="20"/>
-              </w:rPr>
-              <w:t>9</w:t>
-            </w:r>
           </w:p>
         </w:tc>
       </w:tr>
@@ -8539,10 +8376,20 @@
             <w:pPr>
               <w:rPr>
                 <w:rFonts w:asciiTheme="minorHAnsi" w:hAnsiTheme="minorHAnsi" w:cstheme="minorHAnsi"/>
-                <w:sz w:val="20"/>
-                <w:szCs w:val="20"/>
-              </w:rPr>
-            </w:pPr>
+                <w:color w:val="000000" w:themeColor="text1"/>
+                <w:sz w:val="20"/>
+                <w:szCs w:val="20"/>
+              </w:rPr>
+            </w:pPr>
+            <w:r>
+              <w:rPr>
+                <w:rFonts w:asciiTheme="minorHAnsi" w:hAnsiTheme="minorHAnsi" w:cstheme="minorHAnsi"/>
+                <w:color w:val="000000" w:themeColor="text1"/>
+                <w:sz w:val="20"/>
+                <w:szCs w:val="20"/>
+              </w:rPr>
+              <w:t xml:space="preserve">Homework 4 due on Nov. 24</w:t>
+            </w:r>
           </w:p>
         </w:tc>
       </w:tr>

</xml_diff>